<commit_message>
Add case study on agent loops (Polish) in DOCX and PDF formats
</commit_message>
<xml_diff>
--- a/docs/Petle-agentowe_studium-przypadku.docx
+++ b/docs/Petle-agentowe_studium-przypadku.docx
@@ -135,7 +135,7 @@
         <w:pStyle w:val="Etykieta"/>
       </w:pPr>
       <w:r>
-        <w:t>Materiał dla dydaktyków</w:t>
+        <w:t xml:space="preserve">Materiał dla dydaktyków i praktyków AI</w:t>
       </w:r>
     </w:p>
     <w:p>
@@ -151,7 +151,7 @@
         <w:pStyle w:val="Podtytu"/>
       </w:pPr>
       <w:r>
-        <w:t>Przegląd stanu wiedzy, wzorce i weryfikowalne studium przypadku</w:t>
+        <w:t xml:space="preserve">Przegląd stanu wiedzy, wzorce i studium przypadku, które sam odpalisz</w:t>
       </w:r>
     </w:p>
     <w:tbl>
@@ -323,15 +323,7 @@
                 <w:color w:val="12151D"/>
                 <w:sz w:val="30"/>
               </w:rPr>
-              <w:t>lipiec</w:t>
-            </w:r>
-            <w:r>
-              <w:rPr>
-                <w:rFonts w:ascii="Outfit" w:hAnsi="Outfit" w:cs="Outfit"/>
-                <w:color w:val="12151D"/>
-                <w:sz w:val="30"/>
-              </w:rPr>
-              <w:t xml:space="preserve"> 2026</w:t>
+              <w:t>lipiec 2026</w:t>
             </w:r>
           </w:p>
         </w:tc>
@@ -386,7 +378,16 @@
               <w:spacing w:after="0" w:line="276" w:lineRule="auto"/>
             </w:pPr>
             <w:r>
-              <w:t>Pewnie znasz to uczucie: prosisz AI o coś, dostajesz prawie-dobrą odpowiedź, poprawiasz, pytasz znowu – wszystko ręcznie. Pętla agentowa zdejmuje tę pracę z Ciebie: model sam planuje, działa narzędziami, sprawdza własny wynik i poprawia go, aż trafi. To nie marketing, lecz udokumentowany wzorzec inżynieryjny. Ten materiał tłumaczy go po ludzku, pokazuje na żywym przykładzie w Pythonie, a na końcu odsłania nowość: pętlę, która potrafi ulepszać nawet samą siebie.</w:t>
+              <w:t xml:space="preserve">Pewnie znasz to uczucie. Prosisz AI o coś, dostajesz prawie-dobrą odpowiedź, poprawiasz, pytasz znowu, i tak w kółko, wszystko ręcznie. </w:t>
+            </w:r>
+            <w:r>
+              <w:rPr>
+                <w:b/>
+              </w:rPr>
+              <w:t xml:space="preserve">Pętla agentowa</w:t>
+            </w:r>
+            <w:r>
+              <w:t xml:space="preserve"> zdejmuje tę pracę z Ciebie. Model sam planuje, sięga po narzędzia, sprawdza własny wynik i poprawia go, aż trafi. To nie marketing, tylko dobrze udokumentowany wzorzec inżynieryjny. Pisałem ten tekst z myślą o dwóch osobach naraz, o koledze, który uczy tego studentów, i o praktyku, który po prostu chce, żeby jego agent działał. Tłumaczę rzecz po ludzku, pokazuję żywy przykład w Pythonie, dokładam własny benchmark, a na końcu odsłaniam nowość, czyli pętlę, która potrafi ulepszać samą siebie.</w:t>
             </w:r>
           </w:p>
         </w:tc>
@@ -481,6 +482,90 @@
         <w:t xml:space="preserve">  Czym jest pętla agentowa</w:t>
       </w:r>
     </w:p>
+    <w:tbl>
+      <w:tblPr>
+        <w:tblW w:w="9026" w:type="dxa"/>
+        <w:tblBorders>
+          <w:top w:val="single" w:sz="6" w:space="0" w:color="D3E0F8"/>
+          <w:left w:val="single" w:sz="6" w:space="0" w:color="D3E0F8"/>
+          <w:bottom w:val="single" w:sz="6" w:space="0" w:color="D3E0F8"/>
+          <w:right w:val="single" w:sz="6" w:space="0" w:color="D3E0F8"/>
+        </w:tblBorders>
+        <w:tblLayout w:type="fixed"/>
+        <w:tblCellMar>
+          <w:top w:w="130" w:type="dxa"/>
+          <w:left w:w="150" w:type="dxa"/>
+          <w:bottom w:w="130" w:type="dxa"/>
+          <w:right w:w="200" w:type="dxa"/>
+        </w:tblCellMar>
+        <w:tblLook w:val="04A0" w:firstRow="1" w:lastRow="0" w:firstColumn="1" w:lastColumn="0" w:noHBand="0" w:noVBand="1"/>
+      </w:tblPr>
+      <w:tblGrid>
+        <w:gridCol w:w="640"/>
+        <w:gridCol w:w="8386"/>
+      </w:tblGrid>
+      <w:tr>
+        <w:tc>
+          <w:tcPr>
+            <w:tcW w:w="640" w:type="dxa"/>
+            <w:shd w:val="clear" w:color="auto" w:fill="2563EB"/>
+            <w:vAlign w:val="center"/>
+          </w:tcPr>
+          <w:p>
+            <w:pPr>
+              <w:spacing w:after="0" w:line="240" w:lineRule="auto"/>
+              <w:jc w:val="center"/>
+            </w:pPr>
+            <w:r>
+              <w:rPr>
+                <w:rFonts w:ascii="Outfit" w:hAnsi="Outfit" w:cs="Outfit"/>
+                <w:b/>
+                <w:color w:val="FFFFFF"/>
+                <w:sz w:val="28"/>
+              </w:rPr>
+              <w:t xml:space="preserve">i</w:t>
+            </w:r>
+          </w:p>
+        </w:tc>
+        <w:tc>
+          <w:tcPr>
+            <w:tcW w:w="8386" w:type="dxa"/>
+            <w:shd w:val="clear" w:color="auto" w:fill="EEF3FD"/>
+            <w:vAlign w:val="center"/>
+          </w:tcPr>
+          <w:p>
+            <w:pPr>
+              <w:spacing w:after="70" w:line="240" w:lineRule="auto"/>
+            </w:pPr>
+            <w:r>
+              <w:rPr>
+                <w:rFonts w:ascii="Consolas" w:hAnsi="Consolas" w:cs="Consolas"/>
+                <w:b/>
+                <w:caps/>
+                <w:color w:val="1D4ED8"/>
+                <w:spacing w:val="24"/>
+                <w:sz w:val="16"/>
+              </w:rPr>
+              <w:t xml:space="preserve">Informacja</w:t>
+            </w:r>
+          </w:p>
+          <w:p>
+            <w:pPr>
+              <w:spacing w:after="0" w:line="276" w:lineRule="auto"/>
+            </w:pPr>
+            <w:r>
+              <w:rPr>
+                <w:b/>
+              </w:rPr>
+              <w:t xml:space="preserve">Jak to czytać. </w:t>
+            </w:r>
+            <w:r>
+              <w:t xml:space="preserve">Nie musisz śledzić wszystkich prac, które przytaczam, żeby z tego skorzystać. Sekcje 1–3 dają intuicję i słownik pojęć, sekcja 4 to mapa źródeł dla ciekawych, a 5–8 to konkret, który najlepiej pokazać studentom albo odpalić samemu z repozytorium. Jeśli się spieszysz, zacznij od sekcji 5 i 7, reszta poczeka.</w:t>
+            </w:r>
+          </w:p>
+        </w:tc>
+      </w:tr>
+    </w:tbl>
     <w:p>
       <w:pPr>
         <w:spacing w:after="120" w:line="276" w:lineRule="auto"/>
@@ -495,13 +580,7 @@
         <w:t>jeden prompt naraz</w:t>
       </w:r>
       <w:r>
-        <w:t xml:space="preserve">: wpisujemy polecenie, czekamy, poprawiamy, pytamy znowu. Działa, ale to my jesteśmy silnikiem – gdy przestajemy klikać, wszystko </w:t>
-      </w:r>
-      <w:r>
-        <w:t>się zatrzymuje</w:t>
-      </w:r>
-      <w:r>
-        <w:t xml:space="preserve">. Pętla działa inaczej. Dajesz cel raz, a model sam go realizuje: </w:t>
+        <w:t xml:space="preserve">: wpisujemy polecenie, czekamy, poprawiamy, pytamy znowu. Działa, ale to my jesteśmy silnikiem – gdy przestajemy klikać, wszystko się zatrzymuje. Pętla działa inaczej. Dajesz cel raz, a model sam go realizuje: </w:t>
       </w:r>
       <w:r>
         <w:rPr>
@@ -518,28 +597,7 @@
         <w:spacing w:after="120" w:line="276" w:lineRule="auto"/>
       </w:pPr>
       <w:r>
-        <w:t>D</w:t>
-      </w:r>
-      <w:r>
-        <w:t xml:space="preserve">ziś </w:t>
-      </w:r>
-      <w:r>
-        <w:t>mamy jedną</w:t>
-      </w:r>
-      <w:r>
-        <w:t>, prost</w:t>
-      </w:r>
-      <w:r>
-        <w:t>ą</w:t>
-      </w:r>
-      <w:r>
-        <w:t xml:space="preserve"> definicj</w:t>
-      </w:r>
-      <w:r>
-        <w:t>ę pętli agentowej</w:t>
-      </w:r>
-      <w:r>
-        <w:t xml:space="preserve">. Anthropic, po wcześniejszym rozróżnieniu workflow i agentów, opisuje agenta po prostu jako </w:t>
+        <w:t xml:space="preserve">Dziś mamy jedną, prostą definicję pętli agentowej. Anthropic, po wcześniejszym rozróżnieniu workflow i agentów, opisuje agenta po prostu jako </w:t>
       </w:r>
       <w:r>
         <w:rPr>
@@ -731,10 +789,7 @@
               <w:spacing w:after="0" w:line="276" w:lineRule="auto"/>
             </w:pPr>
             <w:r>
-              <w:t>VERIFY (sprawdzenie względem celu)</w:t>
-            </w:r>
-            <w:r>
-              <w:t>,</w:t>
+              <w:t>VERIFY (sprawdzenie względem celu),</w:t>
             </w:r>
           </w:p>
           <w:p>
@@ -1141,15 +1196,7 @@
         <w:spacing w:after="120" w:line="276" w:lineRule="auto"/>
       </w:pPr>
       <w:r>
-        <w:t xml:space="preserve">Reguła kciuka </w:t>
-      </w:r>
-      <w:proofErr w:type="spellStart"/>
-      <w:r>
-        <w:t>Zhanga</w:t>
-      </w:r>
-      <w:proofErr w:type="spellEnd"/>
-      <w:r>
-        <w:t>: jeśli da się zmapować drzewo decyzyjne, zbuduj workflow – dostaniesz więcej trafności, kontroli i niższy koszt niż da jakikolwiek agent. Agent kosztuje, bo eksploruje.</w:t>
+        <w:t>Reguła kciuka Zhanga: jeśli da się zmapować drzewo decyzyjne, zbuduj workflow – dostaniesz więcej trafności, kontroli i niższy koszt niż da jakikolwiek agent. Agent kosztuje, bo eksploruje.</w:t>
       </w:r>
     </w:p>
     <w:p>
@@ -1206,13 +1253,7 @@
         <w:t>Prompt chaining (łańcuch promptów)</w:t>
       </w:r>
       <w:r>
-        <w:t xml:space="preserve"> – rozbicie zadania na sekwencję kroków, w której wyjście jednego wywołania jest wejściem następnego.</w:t>
-      </w:r>
-      <w:r>
-        <w:t xml:space="preserve"> </w:t>
-      </w:r>
-      <w:r>
-        <w:t>Przykład: najpierw wygeneruj konspekt, potem rozwiń go w tekst. Stosuj, gdy zadanie ma jasne, następujące po sobie etapy.</w:t>
+        <w:t xml:space="preserve"> – rozbicie zadania na sekwencję kroków, w której wyjście jednego wywołania jest wejściem następnego. Przykład: najpierw wygeneruj konspekt, potem rozwiń go w tekst. Stosuj, gdy zadanie ma jasne, następujące po sobie etapy.</w:t>
       </w:r>
     </w:p>
     <w:p>
@@ -1226,13 +1267,7 @@
         <w:t>Routing</w:t>
       </w:r>
       <w:r>
-        <w:t xml:space="preserve"> – pierwszy model klasyfikuje wejście i kieruje je do wyspecjalizowanej ścieżki.</w:t>
-      </w:r>
-      <w:r>
-        <w:t xml:space="preserve"> </w:t>
-      </w:r>
-      <w:r>
-        <w:t>Przykład: zgłoszenie trafia do obsługi zwrotów, pomocy technicznej albo sprzedaży. Stosuj, gdy istnieją rozłączne kategorie wymagające innej obsługi.</w:t>
+        <w:t xml:space="preserve"> – pierwszy model klasyfikuje wejście i kieruje je do wyspecjalizowanej ścieżki. Przykład: zgłoszenie trafia do obsługi zwrotów, pomocy technicznej albo sprzedaży. Stosuj, gdy istnieją rozłączne kategorie wymagające innej obsługi.</w:t>
       </w:r>
     </w:p>
     <w:p>
@@ -1246,13 +1281,7 @@
         <w:t>Parallelization (zrównoleglenie)</w:t>
       </w:r>
       <w:r>
-        <w:t xml:space="preserve"> – kilka wywołań pracuje równolegle: albo dzielimy zadanie na niezależne części, albo wykonujemy tę samą pracę kilka razy i głosujemy nad wynikiem.</w:t>
-      </w:r>
-      <w:r>
-        <w:t xml:space="preserve"> </w:t>
-      </w:r>
-      <w:r>
-        <w:t>Przykład: trzy niezależne oceny tekstu i agregacja. Stosuj dla szybkości lub większej pewności.</w:t>
+        <w:t xml:space="preserve"> – kilka wywołań pracuje równolegle: albo dzielimy zadanie na niezależne części, albo wykonujemy tę samą pracę kilka razy i głosujemy nad wynikiem. Przykład: trzy niezależne oceny tekstu i agregacja. Stosuj dla szybkości lub większej pewności.</w:t>
       </w:r>
     </w:p>
     <w:p>
@@ -1266,13 +1295,7 @@
         <w:t>Orchestrator-workers</w:t>
       </w:r>
       <w:r>
-        <w:t xml:space="preserve"> – centralny model dynamicznie dzieli zadanie, deleguje podzadania do workerów i scala wyniki. W odróżnieniu od zrównoleglenia podział nie jest ustalony z góry, lecz powstaje w trakcie.</w:t>
-      </w:r>
-      <w:r>
-        <w:t xml:space="preserve"> </w:t>
-      </w:r>
-      <w:r>
-        <w:t>Przykład: złożona zmiana rozłożona na wiele plików kodu.</w:t>
+        <w:t xml:space="preserve"> – centralny model dynamicznie dzieli zadanie, deleguje podzadania do workerów i scala wyniki. W odróżnieniu od zrównoleglenia podział nie jest ustalony z góry, lecz powstaje w trakcie. Przykład: złożona zmiana rozłożona na wiele plików kodu.</w:t>
       </w:r>
     </w:p>
     <w:p>
@@ -1384,7 +1407,7 @@
         <w:spacing w:after="120" w:line="276" w:lineRule="auto"/>
       </w:pPr>
       <w:r>
-        <w:t>Popularne teksty mówią o „pętli" bez nazwisk. Oto recenzowane podstawy – co każda metoda rozwiązała i jak działa. Punktem wyjścia jest sposób, w jaki w ogóle skłaniamy model do rozumowania krok po kroku.</w:t>
+        <w:t xml:space="preserve">Popularne teksty mówią o „pętli” bez nazwisk. Zebrałem więc recenzowane podstawy w jednym miejscu, żebyś nie musiał ich szukać, i opisałem, co każda metoda rozwiązała oraz jak działa. Nie zakładam, że przeczytałeś każdą z tych prac, spokojnie. Punktem wyjścia jest to, jak w ogóle skłaniamy model do rozumowania krok po kroku.</w:t>
       </w:r>
     </w:p>
     <w:p>
@@ -2067,39 +2090,111 @@
         <w:spacing w:after="120" w:line="276" w:lineRule="auto"/>
       </w:pPr>
       <w:r>
-        <w:t xml:space="preserve">Czas zejść z teorii na ziemię. Wybierzmy zadanie, którego model nie zna z pamięci, bo losujemy je za każdym razem: </w:t>
+        <w:t xml:space="preserve">Czas zejść z teorii na ziemię, bo najłatwiej tłumaczy się na czymś, co odpala się jednym poleceniem. Wybierzmy zadanie, którego model nie zna z pamięci, bo losujemy je za każdym razem: </w:t>
       </w:r>
       <w:r>
         <w:rPr>
           <w:b/>
         </w:rPr>
-        <w:t>subset-sum</w:t>
-      </w:r>
-      <w:r>
-        <w:t>. Masz zbiór liczb i cel</w:t>
-      </w:r>
-      <w:r>
-        <w:t>.</w:t>
-      </w:r>
-      <w:r>
-        <w:t xml:space="preserve"> </w:t>
-      </w:r>
-      <w:r>
-        <w:t>Z</w:t>
-      </w:r>
-      <w:r>
-        <w:t xml:space="preserve">najdź podzbiór, który sumuje się dokładnie do celu. Brzmi niewinnie, ale to jeden z klasycznych trudnych problemów (NP-zupełny): </w:t>
+        <w:t xml:space="preserve">subset-sum</w:t>
+      </w:r>
+      <w:r>
+        <w:t xml:space="preserve">. Masz zbiór liczb i cel. Znajdź podzbiór, który sumuje się dokładnie do celu. Brzmi niewinnie, ale to jeden z klasycznych trudnych problemów, NP-zupełny: </w:t>
       </w:r>
       <w:r>
         <w:rPr>
           <w:b/>
         </w:rPr>
-        <w:t>znaleźć rozwiązanie bywa koszmarnie trudno, ale sprawdzić podanego kandydata – trywialnie łatwo</w:t>
-      </w:r>
-      <w:r>
-        <w:t>. Ta przepaść między „znaleźć" a „sprawdzić" to asymetria generator–weryfikator i właśnie ona tłumaczy, dlaczego brama musi stać poza modelem.</w:t>
+        <w:t xml:space="preserve">znaleźć rozwiązanie bywa koszmarnie trudno, ale sprawdzić podanego kandydata trywialnie łatwo</w:t>
+      </w:r>
+      <w:r>
+        <w:t xml:space="preserve">. Ta przepaść między „znaleźć” a „sprawdzić” to asymetria generator–weryfikator, i właśnie ona tłumaczy, dlaczego brama musi stać poza modelem.</w:t>
       </w:r>
     </w:p>
+    <w:tbl>
+      <w:tblPr>
+        <w:tblW w:w="9026" w:type="dxa"/>
+        <w:tblBorders>
+          <w:top w:val="single" w:sz="6" w:space="0" w:color="CCE6D4"/>
+          <w:left w:val="single" w:sz="6" w:space="0" w:color="CCE6D4"/>
+          <w:bottom w:val="single" w:sz="6" w:space="0" w:color="CCE6D4"/>
+          <w:right w:val="single" w:sz="6" w:space="0" w:color="CCE6D4"/>
+        </w:tblBorders>
+        <w:tblLayout w:type="fixed"/>
+        <w:tblCellMar>
+          <w:top w:w="130" w:type="dxa"/>
+          <w:left w:w="150" w:type="dxa"/>
+          <w:bottom w:w="130" w:type="dxa"/>
+          <w:right w:w="200" w:type="dxa"/>
+        </w:tblCellMar>
+        <w:tblLook w:val="04A0" w:firstRow="1" w:lastRow="0" w:firstColumn="1" w:lastColumn="0" w:noHBand="0" w:noVBand="1"/>
+      </w:tblPr>
+      <w:tblGrid>
+        <w:gridCol w:w="640"/>
+        <w:gridCol w:w="8386"/>
+      </w:tblGrid>
+      <w:tr>
+        <w:tc>
+          <w:tcPr>
+            <w:tcW w:w="640" w:type="dxa"/>
+            <w:shd w:val="clear" w:color="auto" w:fill="2E9E5B"/>
+            <w:vAlign w:val="center"/>
+          </w:tcPr>
+          <w:p>
+            <w:pPr>
+              <w:spacing w:after="0" w:line="240" w:lineRule="auto"/>
+              <w:jc w:val="center"/>
+            </w:pPr>
+            <w:r>
+              <w:rPr>
+                <w:rFonts w:ascii="Outfit" w:hAnsi="Outfit" w:cs="Outfit"/>
+                <w:b/>
+                <w:color w:val="FFFFFF"/>
+                <w:sz w:val="28"/>
+              </w:rPr>
+              <w:t xml:space="preserve">✓</w:t>
+            </w:r>
+          </w:p>
+        </w:tc>
+        <w:tc>
+          <w:tcPr>
+            <w:tcW w:w="8386" w:type="dxa"/>
+            <w:shd w:val="clear" w:color="auto" w:fill="EEF8F1"/>
+            <w:vAlign w:val="center"/>
+          </w:tcPr>
+          <w:p>
+            <w:pPr>
+              <w:spacing w:after="70" w:line="240" w:lineRule="auto"/>
+            </w:pPr>
+            <w:r>
+              <w:rPr>
+                <w:rFonts w:ascii="Consolas" w:hAnsi="Consolas" w:cs="Consolas"/>
+                <w:b/>
+                <w:caps/>
+                <w:color w:val="1E7E45"/>
+                <w:spacing w:val="24"/>
+                <w:sz w:val="16"/>
+              </w:rPr>
+              <w:t xml:space="preserve">Dobra praktyka</w:t>
+            </w:r>
+          </w:p>
+          <w:p>
+            <w:pPr>
+              <w:spacing w:after="0" w:line="276" w:lineRule="auto"/>
+            </w:pPr>
+            <w:r>
+              <w:rPr>
+                <w:b/>
+              </w:rPr>
+              <w:t xml:space="preserve">Cały kod jest otwarty. </w:t>
+            </w:r>
+            <w:r>
+              <w:t xml:space="preserve">Pętla, weryfikatory, pięć problemów i benchmark z sekcji 8 leżą w repozytorium github.com/blablast/agentic-loop. Klonujesz, robisz „uv sync” i odpalasz „uv run python examples/run.py --problem subset_sum”. Jest też wariant offline, bez klucza API, więc możesz dać studentom coś, co realnie działa na zajęciach, a nie tylko slajd.</w:t>
+            </w:r>
+          </w:p>
+        </w:tc>
+      </w:tr>
+    </w:tbl>
     <w:p>
       <w:pPr>
         <w:pStyle w:val="Nagwek2"/>
@@ -2330,7 +2425,6 @@
               </w:rPr>
               <w:t xml:space="preserve">    </w:t>
             </w:r>
-            <w:proofErr w:type="spellStart"/>
             <w:r>
               <w:rPr>
                 <w:rFonts w:cs="Consolas"/>
@@ -2338,98 +2432,26 @@
               </w:rPr>
               <w:t>if</w:t>
             </w:r>
-            <w:proofErr w:type="spellEnd"/>
             <w:r>
               <w:rPr>
                 <w:rFonts w:cs="Consolas"/>
                 <w:color w:val="C9D1D9"/>
               </w:rPr>
-              <w:t xml:space="preserve"> </w:t>
+              <w:t xml:space="preserve"> (total := </w:t>
+            </w:r>
+            <w:r>
+              <w:rPr>
+                <w:rFonts w:cs="Consolas"/>
+                <w:color w:val="D2A8FF"/>
+              </w:rPr>
+              <w:t>sum</w:t>
             </w:r>
             <w:r>
               <w:rPr>
                 <w:rFonts w:cs="Consolas"/>
                 <w:color w:val="C9D1D9"/>
               </w:rPr>
-              <w:t>(</w:t>
-            </w:r>
-            <w:proofErr w:type="spellStart"/>
-            <w:proofErr w:type="gramStart"/>
-            <w:r>
-              <w:rPr>
-                <w:rFonts w:cs="Consolas"/>
-                <w:color w:val="C9D1D9"/>
-              </w:rPr>
-              <w:t>total</w:t>
-            </w:r>
-            <w:proofErr w:type="spellEnd"/>
-            <w:r>
-              <w:rPr>
-                <w:rFonts w:cs="Consolas"/>
-                <w:color w:val="C9D1D9"/>
-              </w:rPr>
-              <w:t xml:space="preserve"> :</w:t>
-            </w:r>
-            <w:proofErr w:type="gramEnd"/>
-            <w:r>
-              <w:rPr>
-                <w:rFonts w:cs="Consolas"/>
-                <w:color w:val="C9D1D9"/>
-              </w:rPr>
-              <w:t xml:space="preserve">= </w:t>
-            </w:r>
-            <w:r>
-              <w:rPr>
-                <w:rFonts w:cs="Consolas"/>
-                <w:color w:val="D2A8FF"/>
-              </w:rPr>
-              <w:t>sum</w:t>
-            </w:r>
-            <w:r>
-              <w:rPr>
-                <w:rFonts w:cs="Consolas"/>
-                <w:color w:val="C9D1D9"/>
-              </w:rPr>
-              <w:t>(</w:t>
-            </w:r>
-            <w:proofErr w:type="spellStart"/>
-            <w:r>
-              <w:rPr>
-                <w:rFonts w:cs="Consolas"/>
-                <w:color w:val="C9D1D9"/>
-              </w:rPr>
-              <w:t>candidate</w:t>
-            </w:r>
-            <w:proofErr w:type="spellEnd"/>
-            <w:r>
-              <w:rPr>
-                <w:rFonts w:cs="Consolas"/>
-                <w:color w:val="C9D1D9"/>
-              </w:rPr>
-              <w:t>)</w:t>
-            </w:r>
-            <w:proofErr w:type="gramStart"/>
-            <w:r>
-              <w:rPr>
-                <w:rFonts w:cs="Consolas"/>
-                <w:color w:val="C9D1D9"/>
-              </w:rPr>
-              <w:t>)</w:t>
-            </w:r>
-            <w:r>
-              <w:rPr>
-                <w:rFonts w:cs="Consolas"/>
-                <w:color w:val="C9D1D9"/>
-              </w:rPr>
-              <w:t xml:space="preserve"> !</w:t>
-            </w:r>
-            <w:proofErr w:type="gramEnd"/>
-            <w:r>
-              <w:rPr>
-                <w:rFonts w:cs="Consolas"/>
-                <w:color w:val="C9D1D9"/>
-              </w:rPr>
-              <w:t>= target:</w:t>
+              <w:t>(candidate)) != target:</w:t>
             </w:r>
           </w:p>
           <w:p>
@@ -2543,41 +2565,7 @@
         <w:spacing w:after="120" w:line="276" w:lineRule="auto"/>
       </w:pPr>
       <w:r>
-        <w:t xml:space="preserve">I tu pointa. </w:t>
-      </w:r>
-      <w:proofErr w:type="gramStart"/>
-      <w:r>
-        <w:t>verify(</w:t>
-      </w:r>
-      <w:proofErr w:type="gramEnd"/>
-      <w:r>
-        <w:t xml:space="preserve">[8, 11, 18, 27], 64) zwraca (True, „OK"), ale prawdopodobny błędny strzał </w:t>
-      </w:r>
-      <w:proofErr w:type="gramStart"/>
-      <w:r>
-        <w:t>verify(</w:t>
-      </w:r>
-      <w:proofErr w:type="gramEnd"/>
-      <w:r>
-        <w:t xml:space="preserve">[6, 8, 11, 18, 27], 64) zwraca (False, „różnica </w:t>
-      </w:r>
-      <w:r>
-        <w:t>-</w:t>
-      </w:r>
-      <w:r>
-        <w:t>6") – natychmiast, bez dyskusji. Model może być w stu procentach przekonany, że ma rację</w:t>
-      </w:r>
-      <w:r>
-        <w:t>.</w:t>
-      </w:r>
-      <w:r>
-        <w:t xml:space="preserve"> </w:t>
-      </w:r>
-      <w:r>
-        <w:t>B</w:t>
-      </w:r>
-      <w:r>
-        <w:t>rama i tak nie przepuści złej odpowiedzi. Tego sama pewność modelu nie daje (Huang i in., 2024).</w:t>
+        <w:t>I tu pointa. verify([8, 11, 18, 27], 64) zwraca (True, „OK"), ale prawdopodobny błędny strzał verify([6, 8, 11, 18, 27], 64) zwraca (False, „różnica -6") – natychmiast, bez dyskusji. Model może być w stu procentach przekonany, że ma rację. Brama i tak nie przepuści złej odpowiedzi. Tego sama pewność modelu nie daje (Huang i in., 2024).</w:t>
       </w:r>
     </w:p>
     <w:p>
@@ -3381,7 +3369,7 @@
         <w:pStyle w:val="Legenda"/>
       </w:pPr>
       <w:r>
-        <w:t>listing 3 – maker na Gemini (gemini-3.5-flash); klucz z GEMINI_API_KEY.</w:t>
+        <w:t xml:space="preserve">listing 3 – maker na Gemini (gemini-3.5-flash), klucz z GEMINI_API_KEY.</w:t>
       </w:r>
     </w:p>
     <w:p>
@@ -3389,13 +3377,7 @@
         <w:spacing w:after="120" w:line="276" w:lineRule="auto"/>
       </w:pPr>
       <w:r>
-        <w:t>Dobry start to gemini-3.5-flash z thinking_level „high" – szybki i ta</w:t>
-      </w:r>
-      <w:r>
-        <w:t>ńszy</w:t>
-      </w:r>
-      <w:r>
-        <w:t>, a pętla robi wiele wywołań. Gdy trafi się twardszy przypadek, sięgasz po mocniejszy gemini-3.1-pro. Reszta kodu się nie zmienia – wymieniasz tylko makera.</w:t>
+        <w:t>Dobry start to gemini-3.5-flash z thinking_level „high" – szybki i tańszy, a pętla robi wiele wywołań. Gdy trafi się twardszy przypadek, sięgasz po mocniejszy gemini-3.1-pro. Reszta kodu się nie zmienia – wymieniasz tylko makera.</w:t>
       </w:r>
     </w:p>
     <w:p>
@@ -3425,7 +3407,7 @@
         <w:spacing w:after="60" w:line="276" w:lineRule="auto"/>
       </w:pPr>
       <w:r>
-        <w:t>Zaczynaj od najprostszego rozwiązania; agent to ostateczność, nie domyślność.</w:t>
+        <w:t xml:space="preserve">Zaczynaj od najprostszego rozwiązania. Agent to ostateczność, nie domyślność.</w:t>
       </w:r>
     </w:p>
     <w:p>
@@ -3451,7 +3433,7 @@
         <w:spacing w:after="60" w:line="276" w:lineRule="auto"/>
       </w:pPr>
       <w:r>
-        <w:t>Weryfikacja zawsze zewnętrzna; pewność modelu to nie to samo co poprawność.</w:t>
+        <w:t xml:space="preserve">Weryfikacja zawsze zewnętrzna. Pewność modelu to nie to samo co poprawność.</w:t>
       </w:r>
     </w:p>
     <w:p>
@@ -3471,7 +3453,6 @@
       <w:pPr>
         <w:pStyle w:val="Nagwek1"/>
       </w:pPr>
-      <w:proofErr w:type="gramStart"/>
       <w:r>
         <w:rPr>
           <w:rFonts w:cs="Outfit"/>
@@ -3483,28 +3464,7 @@
         <w:rPr>
           <w:rFonts w:cs="Outfit"/>
         </w:rPr>
-        <w:t xml:space="preserve">  Wyniki</w:t>
-      </w:r>
-      <w:proofErr w:type="gramEnd"/>
-      <w:r>
-        <w:rPr>
-          <w:rFonts w:cs="Outfit"/>
-        </w:rPr>
-        <w:t xml:space="preserve"> eksperymentów: </w:t>
-      </w:r>
-      <w:proofErr w:type="spellStart"/>
-      <w:r>
-        <w:rPr>
-          <w:rFonts w:cs="Outfit"/>
-        </w:rPr>
-        <w:t>sweep</w:t>
-      </w:r>
-      <w:proofErr w:type="spellEnd"/>
-      <w:r>
-        <w:rPr>
-          <w:rFonts w:cs="Outfit"/>
-        </w:rPr>
-        <w:t xml:space="preserve"> benchmarkowy</w:t>
+        <w:t xml:space="preserve">  Wyniki eksperymentów: sweep benchmarkowy</w:t>
       </w:r>
     </w:p>
     <w:p>
@@ -3512,22 +3472,14 @@
         <w:spacing w:after="120" w:line="276" w:lineRule="auto"/>
       </w:pPr>
       <w:r>
-        <w:t>Studium z sekcji 7 pokazało pętlę na jednym przykładzie. Ale skoro cała teza brzmi „brama, nie autor, decyduje o sukcesie”, to wypada ją zmierzyć. Zamiast jednego przebiegu odpali</w:t>
-      </w:r>
-      <w:r>
-        <w:t>łem</w:t>
-      </w:r>
-      <w:r>
-        <w:t xml:space="preserve"> </w:t>
-      </w:r>
-      <w:proofErr w:type="spellStart"/>
+        <w:t xml:space="preserve">Studium z sekcji 7 pokazało pętlę na jednym przykładzie. Ale skoro cała teza brzmi „brama, nie autor, decyduje o sukcesie”, to wypada ją zmierzyć. Zamiast jednego przebiegu odpaliłem </w:t>
+      </w:r>
       <w:r>
         <w:rPr>
           <w:b/>
         </w:rPr>
         <w:t>sweep</w:t>
       </w:r>
-      <w:proofErr w:type="spellEnd"/>
       <w:r>
         <w:t xml:space="preserve">: ten sam szkielet pętli i ten sam zewnętrzny weryfikator, ale przez siatkę modeli, problemów i losowań. Łącznie </w:t>
       </w:r>
@@ -3538,24 +3490,7 @@
         <w:t>800 przebiegów</w:t>
       </w:r>
       <w:r>
-        <w:t xml:space="preserve"> – 9 modeli × 5 problemów × 2 poziomy „myślenia” (high / minimal) × 10 losowań (seed), z twardym limitem 12 iteracji. Wszystkie modele są lokalne (Ollama), więc porównujemy zdolność pętli, a nie ceny API. Każdy problem to inny kształt kandydata i inna, deterministyczna brama</w:t>
-      </w:r>
-      <w:r>
-        <w:t>.</w:t>
-      </w:r>
-      <w:r>
-        <w:t xml:space="preserve"> </w:t>
-      </w:r>
-      <w:proofErr w:type="spellStart"/>
-      <w:r>
-        <w:t>S</w:t>
-      </w:r>
-      <w:r>
-        <w:t>ubset</w:t>
-      </w:r>
-      <w:proofErr w:type="spellEnd"/>
-      <w:r>
-        <w:t>-sum ze studium jest tylko jednym z pięciu.</w:t>
+        <w:t xml:space="preserve"> – 9 modeli × 5 problemów × 2 poziomy „myślenia” (high / minimal) × 10 losowań (seed), z twardym limitem 12 iteracji. Wszystkie modele są lokalne (Ollama), więc porównujemy zdolność pętli, a nie ceny API. Każdy problem to inny kształt kandydata i inna, deterministyczna brama. Subset-sum ze studium jest tylko jednym z pięciu.</w:t>
       </w:r>
     </w:p>
     <w:tbl>
@@ -4997,34 +4932,34 @@
         <w:spacing w:after="120" w:line="276" w:lineRule="auto"/>
       </w:pPr>
       <w:r>
-        <w:t xml:space="preserve">Poniżej komplet 80 komórek (problem × model × tryb), po 10 seedów każda. </w:t>
+        <w:t xml:space="preserve">Poniżej komplet 80 komórek (problem × model × tryb), po 10 seedów każda. Kolumna </w:t>
       </w:r>
       <w:r>
         <w:rPr>
           <w:b/>
         </w:rPr>
-        <w:t>succ%</w:t>
-      </w:r>
-      <w:r>
-        <w:t xml:space="preserve"> – odsetek rozwiązań; </w:t>
+        <w:t xml:space="preserve">succ%</w:t>
+      </w:r>
+      <w:r>
+        <w:t xml:space="preserve"> to odsetek rozwiązań, </w:t>
       </w:r>
       <w:r>
         <w:rPr>
           <w:b/>
         </w:rPr>
-        <w:t>mediana iter.</w:t>
-      </w:r>
-      <w:r>
-        <w:t xml:space="preserve"> – mediana liczby iteracji (przebieg nierozwiązany liczy się jako 12); </w:t>
+        <w:t xml:space="preserve">mediana iter.</w:t>
+      </w:r>
+      <w:r>
+        <w:t xml:space="preserve"> to mediana liczby iteracji, gdzie przebieg nierozwiązany liczy się jako 12, a </w:t>
       </w:r>
       <w:r>
         <w:rPr>
           <w:b/>
         </w:rPr>
-        <w:t>mediana tok.</w:t>
-      </w:r>
-      <w:r>
-        <w:t xml:space="preserve"> – mediana sumy tokenów na przebieg. deepseek uruchamiano tylko w trybie „high”.</w:t>
+        <w:t xml:space="preserve">mediana tok.</w:t>
+      </w:r>
+      <w:r>
+        <w:t xml:space="preserve"> to mediana sumy tokenów na przebieg. deepseek uruchamiałem tylko w trybie „high”.</w:t>
       </w:r>
     </w:p>
     <w:p>
@@ -5276,13 +5211,7 @@
               <w:rPr>
                 <w:sz w:val="18"/>
               </w:rPr>
-              <w:t>521</w:t>
-            </w:r>
-            <w:r>
-              <w:rPr>
-                <w:sz w:val="18"/>
-              </w:rPr>
-              <w:t>.0</w:t>
+              <w:t>521.0</w:t>
             </w:r>
           </w:p>
         </w:tc>
@@ -5382,13 +5311,7 @@
               <w:rPr>
                 <w:sz w:val="18"/>
               </w:rPr>
-              <w:t>548</w:t>
-            </w:r>
-            <w:r>
-              <w:rPr>
-                <w:sz w:val="18"/>
-              </w:rPr>
-              <w:t>.0</w:t>
+              <w:t>548.0</w:t>
             </w:r>
           </w:p>
         </w:tc>
@@ -5488,25 +5411,7 @@
               <w:rPr>
                 <w:sz w:val="18"/>
               </w:rPr>
-              <w:t>1</w:t>
-            </w:r>
-            <w:r>
-              <w:rPr>
-                <w:sz w:val="18"/>
-              </w:rPr>
-              <w:t> </w:t>
-            </w:r>
-            <w:r>
-              <w:rPr>
-                <w:sz w:val="18"/>
-              </w:rPr>
-              <w:t>050</w:t>
-            </w:r>
-            <w:r>
-              <w:rPr>
-                <w:sz w:val="18"/>
-              </w:rPr>
-              <w:t>.0</w:t>
+              <w:t>1 050.0</w:t>
             </w:r>
           </w:p>
         </w:tc>
@@ -5706,25 +5611,7 @@
               <w:rPr>
                 <w:sz w:val="18"/>
               </w:rPr>
-              <w:t>1</w:t>
-            </w:r>
-            <w:r>
-              <w:rPr>
-                <w:sz w:val="18"/>
-              </w:rPr>
-              <w:t> </w:t>
-            </w:r>
-            <w:r>
-              <w:rPr>
-                <w:sz w:val="18"/>
-              </w:rPr>
-              <w:t>846</w:t>
-            </w:r>
-            <w:r>
-              <w:rPr>
-                <w:sz w:val="18"/>
-              </w:rPr>
-              <w:t>.0</w:t>
+              <w:t>1 846.0</w:t>
             </w:r>
           </w:p>
         </w:tc>
@@ -5924,19 +5811,7 @@
               <w:rPr>
                 <w:sz w:val="18"/>
               </w:rPr>
-              <w:t>1</w:t>
-            </w:r>
-            <w:r>
-              <w:rPr>
-                <w:sz w:val="18"/>
-              </w:rPr>
-              <w:t xml:space="preserve"> </w:t>
-            </w:r>
-            <w:r>
-              <w:rPr>
-                <w:sz w:val="18"/>
-              </w:rPr>
-              <w:t>640.5</w:t>
+              <w:t>1 640.5</w:t>
             </w:r>
           </w:p>
         </w:tc>
@@ -6036,25 +5911,7 @@
               <w:rPr>
                 <w:sz w:val="18"/>
               </w:rPr>
-              <w:t>1</w:t>
-            </w:r>
-            <w:r>
-              <w:rPr>
-                <w:sz w:val="18"/>
-              </w:rPr>
-              <w:t xml:space="preserve"> </w:t>
-            </w:r>
-            <w:r>
-              <w:rPr>
-                <w:sz w:val="18"/>
-              </w:rPr>
-              <w:t>427</w:t>
-            </w:r>
-            <w:r>
-              <w:rPr>
-                <w:sz w:val="18"/>
-              </w:rPr>
-              <w:t>.0</w:t>
+              <w:t>1 427.0</w:t>
             </w:r>
           </w:p>
         </w:tc>
@@ -6154,19 +6011,7 @@
               <w:rPr>
                 <w:sz w:val="18"/>
               </w:rPr>
-              <w:t>3</w:t>
-            </w:r>
-            <w:r>
-              <w:rPr>
-                <w:sz w:val="18"/>
-              </w:rPr>
-              <w:t xml:space="preserve"> </w:t>
-            </w:r>
-            <w:r>
-              <w:rPr>
-                <w:sz w:val="18"/>
-              </w:rPr>
-              <w:t>051.5</w:t>
+              <w:t>3 051.5</w:t>
             </w:r>
           </w:p>
         </w:tc>
@@ -6266,19 +6111,7 @@
               <w:rPr>
                 <w:sz w:val="18"/>
               </w:rPr>
-              <w:t>2</w:t>
-            </w:r>
-            <w:r>
-              <w:rPr>
-                <w:sz w:val="18"/>
-              </w:rPr>
-              <w:t xml:space="preserve"> </w:t>
-            </w:r>
-            <w:r>
-              <w:rPr>
-                <w:sz w:val="18"/>
-              </w:rPr>
-              <w:t>549.5</w:t>
+              <w:t>2 549.5</w:t>
             </w:r>
           </w:p>
         </w:tc>
@@ -6378,25 +6211,7 @@
               <w:rPr>
                 <w:sz w:val="18"/>
               </w:rPr>
-              <w:t>1</w:t>
-            </w:r>
-            <w:r>
-              <w:rPr>
-                <w:sz w:val="18"/>
-              </w:rPr>
-              <w:t> </w:t>
-            </w:r>
-            <w:r>
-              <w:rPr>
-                <w:sz w:val="18"/>
-              </w:rPr>
-              <w:t>889</w:t>
-            </w:r>
-            <w:r>
-              <w:rPr>
-                <w:sz w:val="18"/>
-              </w:rPr>
-              <w:t>.0</w:t>
+              <w:t>1 889.0</w:t>
             </w:r>
           </w:p>
         </w:tc>
@@ -6496,19 +6311,7 @@
               <w:rPr>
                 <w:sz w:val="18"/>
               </w:rPr>
-              <w:t>5</w:t>
-            </w:r>
-            <w:r>
-              <w:rPr>
-                <w:sz w:val="18"/>
-              </w:rPr>
-              <w:t xml:space="preserve"> </w:t>
-            </w:r>
-            <w:r>
-              <w:rPr>
-                <w:sz w:val="18"/>
-              </w:rPr>
-              <w:t>909.5</w:t>
+              <w:t>5 909.5</w:t>
             </w:r>
           </w:p>
         </w:tc>
@@ -6608,19 +6411,7 @@
               <w:rPr>
                 <w:sz w:val="18"/>
               </w:rPr>
-              <w:t>1</w:t>
-            </w:r>
-            <w:r>
-              <w:rPr>
-                <w:sz w:val="18"/>
-              </w:rPr>
-              <w:t xml:space="preserve"> </w:t>
-            </w:r>
-            <w:r>
-              <w:rPr>
-                <w:sz w:val="18"/>
-              </w:rPr>
-              <w:t>124.5</w:t>
+              <w:t>1 124.5</w:t>
             </w:r>
           </w:p>
         </w:tc>
@@ -6720,25 +6511,7 @@
               <w:rPr>
                 <w:sz w:val="18"/>
               </w:rPr>
-              <w:t>4</w:t>
-            </w:r>
-            <w:r>
-              <w:rPr>
-                <w:sz w:val="18"/>
-              </w:rPr>
-              <w:t> </w:t>
-            </w:r>
-            <w:r>
-              <w:rPr>
-                <w:sz w:val="18"/>
-              </w:rPr>
-              <w:t>064</w:t>
-            </w:r>
-            <w:r>
-              <w:rPr>
-                <w:sz w:val="18"/>
-              </w:rPr>
-              <w:t>.0</w:t>
+              <w:t>4 064.0</w:t>
             </w:r>
           </w:p>
         </w:tc>
@@ -6838,13 +6611,7 @@
               <w:rPr>
                 <w:sz w:val="18"/>
               </w:rPr>
-              <w:t>787</w:t>
-            </w:r>
-            <w:r>
-              <w:rPr>
-                <w:sz w:val="18"/>
-              </w:rPr>
-              <w:t>.0</w:t>
+              <w:t>787.0</w:t>
             </w:r>
           </w:p>
         </w:tc>
@@ -7199,19 +6966,7 @@
               <w:rPr>
                 <w:sz w:val="18"/>
               </w:rPr>
-              <w:t>12</w:t>
-            </w:r>
-            <w:r>
-              <w:rPr>
-                <w:sz w:val="18"/>
-              </w:rPr>
-              <w:t xml:space="preserve"> </w:t>
-            </w:r>
-            <w:r>
-              <w:rPr>
-                <w:sz w:val="18"/>
-              </w:rPr>
-              <w:t>447.5</w:t>
+              <w:t>12 447.5</w:t>
             </w:r>
           </w:p>
         </w:tc>
@@ -7311,19 +7066,7 @@
               <w:rPr>
                 <w:sz w:val="18"/>
               </w:rPr>
-              <w:t>13</w:t>
-            </w:r>
-            <w:r>
-              <w:rPr>
-                <w:sz w:val="18"/>
-              </w:rPr>
-              <w:t xml:space="preserve"> </w:t>
-            </w:r>
-            <w:r>
-              <w:rPr>
-                <w:sz w:val="18"/>
-              </w:rPr>
-              <w:t>167.5</w:t>
+              <w:t>13 167.5</w:t>
             </w:r>
           </w:p>
         </w:tc>
@@ -7423,19 +7166,7 @@
               <w:rPr>
                 <w:sz w:val="18"/>
               </w:rPr>
-              <w:t>15</w:t>
-            </w:r>
-            <w:r>
-              <w:rPr>
-                <w:sz w:val="18"/>
-              </w:rPr>
-              <w:t xml:space="preserve"> </w:t>
-            </w:r>
-            <w:r>
-              <w:rPr>
-                <w:sz w:val="18"/>
-              </w:rPr>
-              <w:t>831.5</w:t>
+              <w:t>15 831.5</w:t>
             </w:r>
           </w:p>
         </w:tc>
@@ -7535,25 +7266,7 @@
               <w:rPr>
                 <w:sz w:val="18"/>
               </w:rPr>
-              <w:t>3</w:t>
-            </w:r>
-            <w:r>
-              <w:rPr>
-                <w:sz w:val="18"/>
-              </w:rPr>
-              <w:t> </w:t>
-            </w:r>
-            <w:r>
-              <w:rPr>
-                <w:sz w:val="18"/>
-              </w:rPr>
-              <w:t>715</w:t>
-            </w:r>
-            <w:r>
-              <w:rPr>
-                <w:sz w:val="18"/>
-              </w:rPr>
-              <w:t>.0</w:t>
+              <w:t>3 715.0</w:t>
             </w:r>
           </w:p>
         </w:tc>
@@ -7654,25 +7367,7 @@
               <w:rPr>
                 <w:sz w:val="18"/>
               </w:rPr>
-              <w:t>37</w:t>
-            </w:r>
-            <w:r>
-              <w:rPr>
-                <w:sz w:val="18"/>
-              </w:rPr>
-              <w:t xml:space="preserve"> </w:t>
-            </w:r>
-            <w:r>
-              <w:rPr>
-                <w:sz w:val="18"/>
-              </w:rPr>
-              <w:t>089</w:t>
-            </w:r>
-            <w:r>
-              <w:rPr>
-                <w:sz w:val="18"/>
-              </w:rPr>
-              <w:t>.0</w:t>
+              <w:t>37 089.0</w:t>
             </w:r>
           </w:p>
         </w:tc>
@@ -7772,25 +7467,7 @@
               <w:rPr>
                 <w:sz w:val="18"/>
               </w:rPr>
-              <w:t>3</w:t>
-            </w:r>
-            <w:r>
-              <w:rPr>
-                <w:sz w:val="18"/>
-              </w:rPr>
-              <w:t xml:space="preserve"> </w:t>
-            </w:r>
-            <w:r>
-              <w:rPr>
-                <w:sz w:val="18"/>
-              </w:rPr>
-              <w:t>686</w:t>
-            </w:r>
-            <w:r>
-              <w:rPr>
-                <w:sz w:val="18"/>
-              </w:rPr>
-              <w:t>.0</w:t>
+              <w:t>3 686.0</w:t>
             </w:r>
           </w:p>
         </w:tc>
@@ -7890,19 +7567,7 @@
               <w:rPr>
                 <w:sz w:val="18"/>
               </w:rPr>
-              <w:t>23</w:t>
-            </w:r>
-            <w:r>
-              <w:rPr>
-                <w:sz w:val="18"/>
-              </w:rPr>
-              <w:t xml:space="preserve"> </w:t>
-            </w:r>
-            <w:r>
-              <w:rPr>
-                <w:sz w:val="18"/>
-              </w:rPr>
-              <w:t>985.5</w:t>
+              <w:t>23 985.5</w:t>
             </w:r>
           </w:p>
         </w:tc>
@@ -8002,25 +7667,7 @@
               <w:rPr>
                 <w:sz w:val="18"/>
               </w:rPr>
-              <w:t>17</w:t>
-            </w:r>
-            <w:r>
-              <w:rPr>
-                <w:sz w:val="18"/>
-              </w:rPr>
-              <w:t xml:space="preserve"> </w:t>
-            </w:r>
-            <w:r>
-              <w:rPr>
-                <w:sz w:val="18"/>
-              </w:rPr>
-              <w:t>215</w:t>
-            </w:r>
-            <w:r>
-              <w:rPr>
-                <w:sz w:val="18"/>
-              </w:rPr>
-              <w:t>.0</w:t>
+              <w:t>17 215.0</w:t>
             </w:r>
           </w:p>
         </w:tc>
@@ -8120,25 +7767,7 @@
               <w:rPr>
                 <w:sz w:val="18"/>
               </w:rPr>
-              <w:t>44</w:t>
-            </w:r>
-            <w:r>
-              <w:rPr>
-                <w:sz w:val="18"/>
-              </w:rPr>
-              <w:t xml:space="preserve"> </w:t>
-            </w:r>
-            <w:r>
-              <w:rPr>
-                <w:sz w:val="18"/>
-              </w:rPr>
-              <w:t>660</w:t>
-            </w:r>
-            <w:r>
-              <w:rPr>
-                <w:sz w:val="18"/>
-              </w:rPr>
-              <w:t>.0</w:t>
+              <w:t>44 660.0</w:t>
             </w:r>
           </w:p>
         </w:tc>
@@ -8238,19 +7867,7 @@
               <w:rPr>
                 <w:sz w:val="18"/>
               </w:rPr>
-              <w:t>82</w:t>
-            </w:r>
-            <w:r>
-              <w:rPr>
-                <w:sz w:val="18"/>
-              </w:rPr>
-              <w:t xml:space="preserve"> </w:t>
-            </w:r>
-            <w:r>
-              <w:rPr>
-                <w:sz w:val="18"/>
-              </w:rPr>
-              <w:t>228.5</w:t>
+              <w:t>82 228.5</w:t>
             </w:r>
           </w:p>
         </w:tc>
@@ -8350,25 +7967,7 @@
               <w:rPr>
                 <w:sz w:val="18"/>
               </w:rPr>
-              <w:t>21</w:t>
-            </w:r>
-            <w:r>
-              <w:rPr>
-                <w:sz w:val="18"/>
-              </w:rPr>
-              <w:t xml:space="preserve"> </w:t>
-            </w:r>
-            <w:r>
-              <w:rPr>
-                <w:sz w:val="18"/>
-              </w:rPr>
-              <w:t>138</w:t>
-            </w:r>
-            <w:r>
-              <w:rPr>
-                <w:sz w:val="18"/>
-              </w:rPr>
-              <w:t>.0</w:t>
+              <w:t>21 138.0</w:t>
             </w:r>
           </w:p>
         </w:tc>
@@ -8468,25 +8067,7 @@
               <w:rPr>
                 <w:sz w:val="18"/>
               </w:rPr>
-              <w:t>3</w:t>
-            </w:r>
-            <w:r>
-              <w:rPr>
-                <w:sz w:val="18"/>
-              </w:rPr>
-              <w:t xml:space="preserve"> </w:t>
-            </w:r>
-            <w:r>
-              <w:rPr>
-                <w:sz w:val="18"/>
-              </w:rPr>
-              <w:t>884</w:t>
-            </w:r>
-            <w:r>
-              <w:rPr>
-                <w:sz w:val="18"/>
-              </w:rPr>
-              <w:t>.0</w:t>
+              <w:t>3 884.0</w:t>
             </w:r>
           </w:p>
         </w:tc>
@@ -8586,25 +8167,7 @@
               <w:rPr>
                 <w:sz w:val="18"/>
               </w:rPr>
-              <w:t>11</w:t>
-            </w:r>
-            <w:r>
-              <w:rPr>
-                <w:sz w:val="18"/>
-              </w:rPr>
-              <w:t xml:space="preserve"> </w:t>
-            </w:r>
-            <w:r>
-              <w:rPr>
-                <w:sz w:val="18"/>
-              </w:rPr>
-              <w:t>941</w:t>
-            </w:r>
-            <w:r>
-              <w:rPr>
-                <w:sz w:val="18"/>
-              </w:rPr>
-              <w:t>.0</w:t>
+              <w:t>11 941.0</w:t>
             </w:r>
           </w:p>
         </w:tc>
@@ -8704,19 +8267,7 @@
               <w:rPr>
                 <w:sz w:val="18"/>
               </w:rPr>
-              <w:t>3</w:t>
-            </w:r>
-            <w:r>
-              <w:rPr>
-                <w:sz w:val="18"/>
-              </w:rPr>
-              <w:t xml:space="preserve"> </w:t>
-            </w:r>
-            <w:r>
-              <w:rPr>
-                <w:sz w:val="18"/>
-              </w:rPr>
-              <w:t>684.5</w:t>
+              <w:t>3 684.5</w:t>
             </w:r>
           </w:p>
         </w:tc>
@@ -8816,19 +8367,7 @@
               <w:rPr>
                 <w:sz w:val="18"/>
               </w:rPr>
-              <w:t>12</w:t>
-            </w:r>
-            <w:r>
-              <w:rPr>
-                <w:sz w:val="18"/>
-              </w:rPr>
-              <w:t xml:space="preserve"> </w:t>
-            </w:r>
-            <w:r>
-              <w:rPr>
-                <w:sz w:val="18"/>
-              </w:rPr>
-              <w:t>557.5</w:t>
+              <w:t>12 557.5</w:t>
             </w:r>
           </w:p>
         </w:tc>
@@ -8928,19 +8467,7 @@
               <w:rPr>
                 <w:sz w:val="18"/>
               </w:rPr>
-              <w:t>47</w:t>
-            </w:r>
-            <w:r>
-              <w:rPr>
-                <w:sz w:val="18"/>
-              </w:rPr>
-              <w:t xml:space="preserve"> </w:t>
-            </w:r>
-            <w:r>
-              <w:rPr>
-                <w:sz w:val="18"/>
-              </w:rPr>
-              <w:t>767.5</w:t>
+              <w:t>47 767.5</w:t>
             </w:r>
           </w:p>
         </w:tc>
@@ -9195,19 +8722,7 @@
               <w:rPr>
                 <w:sz w:val="18"/>
               </w:rPr>
-              <w:t>1</w:t>
-            </w:r>
-            <w:r>
-              <w:rPr>
-                <w:sz w:val="18"/>
-              </w:rPr>
-              <w:t xml:space="preserve"> </w:t>
-            </w:r>
-            <w:r>
-              <w:rPr>
-                <w:sz w:val="18"/>
-              </w:rPr>
-              <w:t>854.5</w:t>
+              <w:t>1 854.5</w:t>
             </w:r>
           </w:p>
         </w:tc>
@@ -9307,19 +8822,7 @@
               <w:rPr>
                 <w:sz w:val="18"/>
               </w:rPr>
-              <w:t>2</w:t>
-            </w:r>
-            <w:r>
-              <w:rPr>
-                <w:sz w:val="18"/>
-              </w:rPr>
-              <w:t xml:space="preserve"> </w:t>
-            </w:r>
-            <w:r>
-              <w:rPr>
-                <w:sz w:val="18"/>
-              </w:rPr>
-              <w:t>284.5</w:t>
+              <w:t>2 284.5</w:t>
             </w:r>
           </w:p>
         </w:tc>
@@ -9419,19 +8922,7 @@
               <w:rPr>
                 <w:sz w:val="18"/>
               </w:rPr>
-              <w:t>1</w:t>
-            </w:r>
-            <w:r>
-              <w:rPr>
-                <w:sz w:val="18"/>
-              </w:rPr>
-              <w:t xml:space="preserve"> </w:t>
-            </w:r>
-            <w:r>
-              <w:rPr>
-                <w:sz w:val="18"/>
-              </w:rPr>
-              <w:t>686.5</w:t>
+              <w:t>1 686.5</w:t>
             </w:r>
           </w:p>
         </w:tc>
@@ -9531,13 +9022,7 @@
               <w:rPr>
                 <w:sz w:val="18"/>
               </w:rPr>
-              <w:t>261</w:t>
-            </w:r>
-            <w:r>
-              <w:rPr>
-                <w:sz w:val="18"/>
-              </w:rPr>
-              <w:t>.0</w:t>
+              <w:t>261.0</w:t>
             </w:r>
           </w:p>
         </w:tc>
@@ -9637,19 +9122,7 @@
               <w:rPr>
                 <w:sz w:val="18"/>
               </w:rPr>
-              <w:t>5</w:t>
-            </w:r>
-            <w:r>
-              <w:rPr>
-                <w:sz w:val="18"/>
-              </w:rPr>
-              <w:t xml:space="preserve"> </w:t>
-            </w:r>
-            <w:r>
-              <w:rPr>
-                <w:sz w:val="18"/>
-              </w:rPr>
-              <w:t>411.5</w:t>
+              <w:t>5 411.5</w:t>
             </w:r>
           </w:p>
         </w:tc>
@@ -9749,13 +9222,7 @@
               <w:rPr>
                 <w:sz w:val="18"/>
               </w:rPr>
-              <w:t>989</w:t>
-            </w:r>
-            <w:r>
-              <w:rPr>
-                <w:sz w:val="18"/>
-              </w:rPr>
-              <w:t>.0</w:t>
+              <w:t>989.0</w:t>
             </w:r>
           </w:p>
         </w:tc>
@@ -9855,25 +9322,7 @@
               <w:rPr>
                 <w:sz w:val="18"/>
               </w:rPr>
-              <w:t>2</w:t>
-            </w:r>
-            <w:r>
-              <w:rPr>
-                <w:sz w:val="18"/>
-              </w:rPr>
-              <w:t xml:space="preserve"> </w:t>
-            </w:r>
-            <w:r>
-              <w:rPr>
-                <w:sz w:val="18"/>
-              </w:rPr>
-              <w:t>981</w:t>
-            </w:r>
-            <w:r>
-              <w:rPr>
-                <w:sz w:val="18"/>
-              </w:rPr>
-              <w:t>.0</w:t>
+              <w:t>2 981.0</w:t>
             </w:r>
           </w:p>
         </w:tc>
@@ -9973,19 +9422,7 @@
               <w:rPr>
                 <w:sz w:val="18"/>
               </w:rPr>
-              <w:t>3</w:t>
-            </w:r>
-            <w:r>
-              <w:rPr>
-                <w:sz w:val="18"/>
-              </w:rPr>
-              <w:t xml:space="preserve"> </w:t>
-            </w:r>
-            <w:r>
-              <w:rPr>
-                <w:sz w:val="18"/>
-              </w:rPr>
-              <w:t>042.5</w:t>
+              <w:t>3 042.5</w:t>
             </w:r>
           </w:p>
         </w:tc>
@@ -10085,25 +9522,7 @@
               <w:rPr>
                 <w:sz w:val="18"/>
               </w:rPr>
-              <w:t>8</w:t>
-            </w:r>
-            <w:r>
-              <w:rPr>
-                <w:sz w:val="18"/>
-              </w:rPr>
-              <w:t xml:space="preserve"> </w:t>
-            </w:r>
-            <w:r>
-              <w:rPr>
-                <w:sz w:val="18"/>
-              </w:rPr>
-              <w:t>082</w:t>
-            </w:r>
-            <w:r>
-              <w:rPr>
-                <w:sz w:val="18"/>
-              </w:rPr>
-              <w:t>.0</w:t>
+              <w:t>8 082.0</w:t>
             </w:r>
           </w:p>
         </w:tc>
@@ -10203,25 +9622,7 @@
               <w:rPr>
                 <w:sz w:val="18"/>
               </w:rPr>
-              <w:t>6</w:t>
-            </w:r>
-            <w:r>
-              <w:rPr>
-                <w:sz w:val="18"/>
-              </w:rPr>
-              <w:t xml:space="preserve"> </w:t>
-            </w:r>
-            <w:r>
-              <w:rPr>
-                <w:sz w:val="18"/>
-              </w:rPr>
-              <w:t>793</w:t>
-            </w:r>
-            <w:r>
-              <w:rPr>
-                <w:sz w:val="18"/>
-              </w:rPr>
-              <w:t>.0</w:t>
+              <w:t>6 793.0</w:t>
             </w:r>
           </w:p>
         </w:tc>
@@ -10321,25 +9722,7 @@
               <w:rPr>
                 <w:sz w:val="18"/>
               </w:rPr>
-              <w:t>6</w:t>
-            </w:r>
-            <w:r>
-              <w:rPr>
-                <w:sz w:val="18"/>
-              </w:rPr>
-              <w:t xml:space="preserve"> </w:t>
-            </w:r>
-            <w:r>
-              <w:rPr>
-                <w:sz w:val="18"/>
-              </w:rPr>
-              <w:t>459</w:t>
-            </w:r>
-            <w:r>
-              <w:rPr>
-                <w:sz w:val="18"/>
-              </w:rPr>
-              <w:t>.0</w:t>
+              <w:t>6 459.0</w:t>
             </w:r>
           </w:p>
         </w:tc>
@@ -10439,25 +9822,7 @@
               <w:rPr>
                 <w:sz w:val="18"/>
               </w:rPr>
-              <w:t>6</w:t>
-            </w:r>
-            <w:r>
-              <w:rPr>
-                <w:sz w:val="18"/>
-              </w:rPr>
-              <w:t xml:space="preserve"> </w:t>
-            </w:r>
-            <w:r>
-              <w:rPr>
-                <w:sz w:val="18"/>
-              </w:rPr>
-              <w:t>105</w:t>
-            </w:r>
-            <w:r>
-              <w:rPr>
-                <w:sz w:val="18"/>
-              </w:rPr>
-              <w:t>.0</w:t>
+              <w:t>6 105.0</w:t>
             </w:r>
           </w:p>
         </w:tc>
@@ -10557,25 +9922,7 @@
               <w:rPr>
                 <w:sz w:val="18"/>
               </w:rPr>
-              <w:t>2</w:t>
-            </w:r>
-            <w:r>
-              <w:rPr>
-                <w:sz w:val="18"/>
-              </w:rPr>
-              <w:t xml:space="preserve"> </w:t>
-            </w:r>
-            <w:r>
-              <w:rPr>
-                <w:sz w:val="18"/>
-              </w:rPr>
-              <w:t>192</w:t>
-            </w:r>
-            <w:r>
-              <w:rPr>
-                <w:sz w:val="18"/>
-              </w:rPr>
-              <w:t>.0</w:t>
+              <w:t>2 192.0</w:t>
             </w:r>
           </w:p>
         </w:tc>
@@ -10675,25 +10022,7 @@
               <w:rPr>
                 <w:sz w:val="18"/>
               </w:rPr>
-              <w:t>6</w:t>
-            </w:r>
-            <w:r>
-              <w:rPr>
-                <w:sz w:val="18"/>
-              </w:rPr>
-              <w:t xml:space="preserve"> </w:t>
-            </w:r>
-            <w:r>
-              <w:rPr>
-                <w:sz w:val="18"/>
-              </w:rPr>
-              <w:t>829</w:t>
-            </w:r>
-            <w:r>
-              <w:rPr>
-                <w:sz w:val="18"/>
-              </w:rPr>
-              <w:t>.0</w:t>
+              <w:t>6 829.0</w:t>
             </w:r>
           </w:p>
         </w:tc>
@@ -10793,25 +10122,7 @@
               <w:rPr>
                 <w:sz w:val="18"/>
               </w:rPr>
-              <w:t>23</w:t>
-            </w:r>
-            <w:r>
-              <w:rPr>
-                <w:sz w:val="18"/>
-              </w:rPr>
-              <w:t xml:space="preserve"> </w:t>
-            </w:r>
-            <w:r>
-              <w:rPr>
-                <w:sz w:val="18"/>
-              </w:rPr>
-              <w:t>200</w:t>
-            </w:r>
-            <w:r>
-              <w:rPr>
-                <w:sz w:val="18"/>
-              </w:rPr>
-              <w:t>.0</w:t>
+              <w:t>23 200.0</w:t>
             </w:r>
           </w:p>
         </w:tc>
@@ -10911,25 +10222,7 @@
               <w:rPr>
                 <w:sz w:val="18"/>
               </w:rPr>
-              <w:t>37</w:t>
-            </w:r>
-            <w:r>
-              <w:rPr>
-                <w:sz w:val="18"/>
-              </w:rPr>
-              <w:t xml:space="preserve"> </w:t>
-            </w:r>
-            <w:r>
-              <w:rPr>
-                <w:sz w:val="18"/>
-              </w:rPr>
-              <w:t>440</w:t>
-            </w:r>
-            <w:r>
-              <w:rPr>
-                <w:sz w:val="18"/>
-              </w:rPr>
-              <w:t>.0</w:t>
+              <w:t>37 440.0</w:t>
             </w:r>
           </w:p>
         </w:tc>
@@ -11184,25 +10477,7 @@
               <w:rPr>
                 <w:sz w:val="18"/>
               </w:rPr>
-              <w:t>116</w:t>
-            </w:r>
-            <w:r>
-              <w:rPr>
-                <w:sz w:val="18"/>
-              </w:rPr>
-              <w:t xml:space="preserve"> </w:t>
-            </w:r>
-            <w:r>
-              <w:rPr>
-                <w:sz w:val="18"/>
-              </w:rPr>
-              <w:t>368</w:t>
-            </w:r>
-            <w:r>
-              <w:rPr>
-                <w:sz w:val="18"/>
-              </w:rPr>
-              <w:t>.0</w:t>
+              <w:t>116 368.0</w:t>
             </w:r>
           </w:p>
         </w:tc>
@@ -11302,19 +10577,7 @@
               <w:rPr>
                 <w:sz w:val="18"/>
               </w:rPr>
-              <w:t>82</w:t>
-            </w:r>
-            <w:r>
-              <w:rPr>
-                <w:sz w:val="18"/>
-              </w:rPr>
-              <w:t xml:space="preserve"> </w:t>
-            </w:r>
-            <w:r>
-              <w:rPr>
-                <w:sz w:val="18"/>
-              </w:rPr>
-              <w:t>334.5</w:t>
+              <w:t>82 334.5</w:t>
             </w:r>
           </w:p>
         </w:tc>
@@ -11415,25 +10678,7 @@
               <w:rPr>
                 <w:sz w:val="18"/>
               </w:rPr>
-              <w:t>104</w:t>
-            </w:r>
-            <w:r>
-              <w:rPr>
-                <w:sz w:val="18"/>
-              </w:rPr>
-              <w:t xml:space="preserve"> </w:t>
-            </w:r>
-            <w:r>
-              <w:rPr>
-                <w:sz w:val="18"/>
-              </w:rPr>
-              <w:t>214</w:t>
-            </w:r>
-            <w:r>
-              <w:rPr>
-                <w:sz w:val="18"/>
-              </w:rPr>
-              <w:t>.0</w:t>
+              <w:t>104 214.0</w:t>
             </w:r>
           </w:p>
         </w:tc>
@@ -11533,19 +10778,7 @@
               <w:rPr>
                 <w:sz w:val="18"/>
               </w:rPr>
-              <w:t>13</w:t>
-            </w:r>
-            <w:r>
-              <w:rPr>
-                <w:sz w:val="18"/>
-              </w:rPr>
-              <w:t xml:space="preserve"> </w:t>
-            </w:r>
-            <w:r>
-              <w:rPr>
-                <w:sz w:val="18"/>
-              </w:rPr>
-              <w:t>578.5</w:t>
+              <w:t>13 578.5</w:t>
             </w:r>
           </w:p>
         </w:tc>
@@ -11645,25 +10878,7 @@
               <w:rPr>
                 <w:sz w:val="18"/>
               </w:rPr>
-              <w:t>250</w:t>
-            </w:r>
-            <w:r>
-              <w:rPr>
-                <w:sz w:val="18"/>
-              </w:rPr>
-              <w:t xml:space="preserve"> </w:t>
-            </w:r>
-            <w:r>
-              <w:rPr>
-                <w:sz w:val="18"/>
-              </w:rPr>
-              <w:t>312</w:t>
-            </w:r>
-            <w:r>
-              <w:rPr>
-                <w:sz w:val="18"/>
-              </w:rPr>
-              <w:t>.0</w:t>
+              <w:t>250 312.0</w:t>
             </w:r>
           </w:p>
         </w:tc>
@@ -11763,25 +10978,7 @@
               <w:rPr>
                 <w:sz w:val="18"/>
               </w:rPr>
-              <w:t>63</w:t>
-            </w:r>
-            <w:r>
-              <w:rPr>
-                <w:sz w:val="18"/>
-              </w:rPr>
-              <w:t xml:space="preserve"> </w:t>
-            </w:r>
-            <w:r>
-              <w:rPr>
-                <w:sz w:val="18"/>
-              </w:rPr>
-              <w:t>436</w:t>
-            </w:r>
-            <w:r>
-              <w:rPr>
-                <w:sz w:val="18"/>
-              </w:rPr>
-              <w:t>.0</w:t>
+              <w:t>63 436.0</w:t>
             </w:r>
           </w:p>
         </w:tc>
@@ -11881,25 +11078,7 @@
               <w:rPr>
                 <w:sz w:val="18"/>
               </w:rPr>
-              <w:t>125</w:t>
-            </w:r>
-            <w:r>
-              <w:rPr>
-                <w:sz w:val="18"/>
-              </w:rPr>
-              <w:t xml:space="preserve"> </w:t>
-            </w:r>
-            <w:r>
-              <w:rPr>
-                <w:sz w:val="18"/>
-              </w:rPr>
-              <w:t>662</w:t>
-            </w:r>
-            <w:r>
-              <w:rPr>
-                <w:sz w:val="18"/>
-              </w:rPr>
-              <w:t>.0</w:t>
+              <w:t>125 662.0</w:t>
             </w:r>
           </w:p>
         </w:tc>
@@ -11999,25 +11178,7 @@
               <w:rPr>
                 <w:sz w:val="18"/>
               </w:rPr>
-              <w:t>137</w:t>
-            </w:r>
-            <w:r>
-              <w:rPr>
-                <w:sz w:val="18"/>
-              </w:rPr>
-              <w:t xml:space="preserve"> </w:t>
-            </w:r>
-            <w:r>
-              <w:rPr>
-                <w:sz w:val="18"/>
-              </w:rPr>
-              <w:t>346</w:t>
-            </w:r>
-            <w:r>
-              <w:rPr>
-                <w:sz w:val="18"/>
-              </w:rPr>
-              <w:t>.0</w:t>
+              <w:t>137 346.0</w:t>
             </w:r>
           </w:p>
         </w:tc>
@@ -12117,25 +11278,7 @@
               <w:rPr>
                 <w:sz w:val="18"/>
               </w:rPr>
-              <w:t>188</w:t>
-            </w:r>
-            <w:r>
-              <w:rPr>
-                <w:sz w:val="18"/>
-              </w:rPr>
-              <w:t xml:space="preserve"> </w:t>
-            </w:r>
-            <w:r>
-              <w:rPr>
-                <w:sz w:val="18"/>
-              </w:rPr>
-              <w:t>898</w:t>
-            </w:r>
-            <w:r>
-              <w:rPr>
-                <w:sz w:val="18"/>
-              </w:rPr>
-              <w:t>.0</w:t>
+              <w:t>188 898.0</w:t>
             </w:r>
           </w:p>
         </w:tc>
@@ -12235,25 +11378,7 @@
               <w:rPr>
                 <w:sz w:val="18"/>
               </w:rPr>
-              <w:t>192</w:t>
-            </w:r>
-            <w:r>
-              <w:rPr>
-                <w:sz w:val="18"/>
-              </w:rPr>
-              <w:t xml:space="preserve"> </w:t>
-            </w:r>
-            <w:r>
-              <w:rPr>
-                <w:sz w:val="18"/>
-              </w:rPr>
-              <w:t>484</w:t>
-            </w:r>
-            <w:r>
-              <w:rPr>
-                <w:sz w:val="18"/>
-              </w:rPr>
-              <w:t>.0</w:t>
+              <w:t>192 484.0</w:t>
             </w:r>
           </w:p>
         </w:tc>
@@ -12353,25 +11478,7 @@
               <w:rPr>
                 <w:sz w:val="18"/>
               </w:rPr>
-              <w:t>141</w:t>
-            </w:r>
-            <w:r>
-              <w:rPr>
-                <w:sz w:val="18"/>
-              </w:rPr>
-              <w:t xml:space="preserve"> </w:t>
-            </w:r>
-            <w:r>
-              <w:rPr>
-                <w:sz w:val="18"/>
-              </w:rPr>
-              <w:t>372</w:t>
-            </w:r>
-            <w:r>
-              <w:rPr>
-                <w:sz w:val="18"/>
-              </w:rPr>
-              <w:t>.0</w:t>
+              <w:t>141 372.0</w:t>
             </w:r>
           </w:p>
         </w:tc>
@@ -12471,25 +11578,7 @@
               <w:rPr>
                 <w:sz w:val="18"/>
               </w:rPr>
-              <w:t>13</w:t>
-            </w:r>
-            <w:r>
-              <w:rPr>
-                <w:sz w:val="18"/>
-              </w:rPr>
-              <w:t xml:space="preserve"> </w:t>
-            </w:r>
-            <w:r>
-              <w:rPr>
-                <w:sz w:val="18"/>
-              </w:rPr>
-              <w:t>065</w:t>
-            </w:r>
-            <w:r>
-              <w:rPr>
-                <w:sz w:val="18"/>
-              </w:rPr>
-              <w:t>.0</w:t>
+              <w:t>13 065.0</w:t>
             </w:r>
           </w:p>
         </w:tc>
@@ -12589,19 +11678,7 @@
               <w:rPr>
                 <w:sz w:val="18"/>
               </w:rPr>
-              <w:t>64</w:t>
-            </w:r>
-            <w:r>
-              <w:rPr>
-                <w:sz w:val="18"/>
-              </w:rPr>
-              <w:t xml:space="preserve"> </w:t>
-            </w:r>
-            <w:r>
-              <w:rPr>
-                <w:sz w:val="18"/>
-              </w:rPr>
-              <w:t>591.5</w:t>
+              <w:t>64 591.5</w:t>
             </w:r>
           </w:p>
         </w:tc>
@@ -12701,19 +11778,7 @@
               <w:rPr>
                 <w:sz w:val="18"/>
               </w:rPr>
-              <w:t>12</w:t>
-            </w:r>
-            <w:r>
-              <w:rPr>
-                <w:sz w:val="18"/>
-              </w:rPr>
-              <w:t xml:space="preserve"> </w:t>
-            </w:r>
-            <w:r>
-              <w:rPr>
-                <w:sz w:val="18"/>
-              </w:rPr>
-              <w:t>444.5</w:t>
+              <w:t>12 444.5</w:t>
             </w:r>
           </w:p>
         </w:tc>
@@ -12813,25 +11878,7 @@
               <w:rPr>
                 <w:sz w:val="18"/>
               </w:rPr>
-              <w:t>800</w:t>
-            </w:r>
-            <w:r>
-              <w:rPr>
-                <w:sz w:val="18"/>
-              </w:rPr>
-              <w:t xml:space="preserve"> </w:t>
-            </w:r>
-            <w:r>
-              <w:rPr>
-                <w:sz w:val="18"/>
-              </w:rPr>
-              <w:t>701</w:t>
-            </w:r>
-            <w:r>
-              <w:rPr>
-                <w:sz w:val="18"/>
-              </w:rPr>
-              <w:t>.0</w:t>
+              <w:t>800 701.0</w:t>
             </w:r>
           </w:p>
         </w:tc>
@@ -12931,25 +11978,7 @@
               <w:rPr>
                 <w:sz w:val="18"/>
               </w:rPr>
-              <w:t>762</w:t>
-            </w:r>
-            <w:r>
-              <w:rPr>
-                <w:sz w:val="18"/>
-              </w:rPr>
-              <w:t xml:space="preserve"> </w:t>
-            </w:r>
-            <w:r>
-              <w:rPr>
-                <w:sz w:val="18"/>
-              </w:rPr>
-              <w:t>882</w:t>
-            </w:r>
-            <w:r>
-              <w:rPr>
-                <w:sz w:val="18"/>
-              </w:rPr>
-              <w:t>.0</w:t>
+              <w:t>762 882.0</w:t>
             </w:r>
           </w:p>
         </w:tc>
@@ -13204,19 +12233,7 @@
               <w:rPr>
                 <w:sz w:val="18"/>
               </w:rPr>
-              <w:t>20</w:t>
-            </w:r>
-            <w:r>
-              <w:rPr>
-                <w:sz w:val="18"/>
-              </w:rPr>
-              <w:t xml:space="preserve"> </w:t>
-            </w:r>
-            <w:r>
-              <w:rPr>
-                <w:sz w:val="18"/>
-              </w:rPr>
-              <w:t>070.5</w:t>
+              <w:t>20 070.5</w:t>
             </w:r>
           </w:p>
         </w:tc>
@@ -13316,25 +12333,7 @@
               <w:rPr>
                 <w:sz w:val="18"/>
               </w:rPr>
-              <w:t>19</w:t>
-            </w:r>
-            <w:r>
-              <w:rPr>
-                <w:sz w:val="18"/>
-              </w:rPr>
-              <w:t xml:space="preserve"> </w:t>
-            </w:r>
-            <w:r>
-              <w:rPr>
-                <w:sz w:val="18"/>
-              </w:rPr>
-              <w:t>203</w:t>
-            </w:r>
-            <w:r>
-              <w:rPr>
-                <w:sz w:val="18"/>
-              </w:rPr>
-              <w:t>.0</w:t>
+              <w:t>19 203.0</w:t>
             </w:r>
           </w:p>
         </w:tc>
@@ -13434,25 +12433,7 @@
               <w:rPr>
                 <w:sz w:val="18"/>
               </w:rPr>
-              <w:t>14</w:t>
-            </w:r>
-            <w:r>
-              <w:rPr>
-                <w:sz w:val="18"/>
-              </w:rPr>
-              <w:t xml:space="preserve"> </w:t>
-            </w:r>
-            <w:r>
-              <w:rPr>
-                <w:sz w:val="18"/>
-              </w:rPr>
-              <w:t>154</w:t>
-            </w:r>
-            <w:r>
-              <w:rPr>
-                <w:sz w:val="18"/>
-              </w:rPr>
-              <w:t>.0</w:t>
+              <w:t>14 154.0</w:t>
             </w:r>
           </w:p>
         </w:tc>
@@ -13552,25 +12533,7 @@
               <w:rPr>
                 <w:sz w:val="18"/>
               </w:rPr>
-              <w:t>5</w:t>
-            </w:r>
-            <w:r>
-              <w:rPr>
-                <w:sz w:val="18"/>
-              </w:rPr>
-              <w:t xml:space="preserve"> </w:t>
-            </w:r>
-            <w:r>
-              <w:rPr>
-                <w:sz w:val="18"/>
-              </w:rPr>
-              <w:t>252</w:t>
-            </w:r>
-            <w:r>
-              <w:rPr>
-                <w:sz w:val="18"/>
-              </w:rPr>
-              <w:t>.0</w:t>
+              <w:t>5 252.0</w:t>
             </w:r>
           </w:p>
         </w:tc>
@@ -13670,25 +12633,7 @@
               <w:rPr>
                 <w:sz w:val="18"/>
               </w:rPr>
-              <w:t>37</w:t>
-            </w:r>
-            <w:r>
-              <w:rPr>
-                <w:sz w:val="18"/>
-              </w:rPr>
-              <w:t xml:space="preserve"> </w:t>
-            </w:r>
-            <w:r>
-              <w:rPr>
-                <w:sz w:val="18"/>
-              </w:rPr>
-              <w:t>048</w:t>
-            </w:r>
-            <w:r>
-              <w:rPr>
-                <w:sz w:val="18"/>
-              </w:rPr>
-              <w:t>.0</w:t>
+              <w:t>37 048.0</w:t>
             </w:r>
           </w:p>
         </w:tc>
@@ -13788,19 +12733,7 @@
               <w:rPr>
                 <w:sz w:val="18"/>
               </w:rPr>
-              <w:t>6</w:t>
-            </w:r>
-            <w:r>
-              <w:rPr>
-                <w:sz w:val="18"/>
-              </w:rPr>
-              <w:t xml:space="preserve"> </w:t>
-            </w:r>
-            <w:r>
-              <w:rPr>
-                <w:sz w:val="18"/>
-              </w:rPr>
-              <w:t>233.5</w:t>
+              <w:t>6 233.5</w:t>
             </w:r>
           </w:p>
         </w:tc>
@@ -13900,19 +12833,7 @@
               <w:rPr>
                 <w:sz w:val="18"/>
               </w:rPr>
-              <w:t>55</w:t>
-            </w:r>
-            <w:r>
-              <w:rPr>
-                <w:sz w:val="18"/>
-              </w:rPr>
-              <w:t xml:space="preserve"> </w:t>
-            </w:r>
-            <w:r>
-              <w:rPr>
-                <w:sz w:val="18"/>
-              </w:rPr>
-              <w:t>624.5</w:t>
+              <w:t>55 624.5</w:t>
             </w:r>
           </w:p>
         </w:tc>
@@ -14012,25 +12933,7 @@
               <w:rPr>
                 <w:sz w:val="18"/>
               </w:rPr>
-              <w:t>48</w:t>
-            </w:r>
-            <w:r>
-              <w:rPr>
-                <w:sz w:val="18"/>
-              </w:rPr>
-              <w:t xml:space="preserve"> </w:t>
-            </w:r>
-            <w:r>
-              <w:rPr>
-                <w:sz w:val="18"/>
-              </w:rPr>
-              <w:t>622</w:t>
-            </w:r>
-            <w:r>
-              <w:rPr>
-                <w:sz w:val="18"/>
-              </w:rPr>
-              <w:t>.0</w:t>
+              <w:t>48 622.0</w:t>
             </w:r>
           </w:p>
         </w:tc>
@@ -14130,25 +13033,7 @@
               <w:rPr>
                 <w:sz w:val="18"/>
               </w:rPr>
-              <w:t>118</w:t>
-            </w:r>
-            <w:r>
-              <w:rPr>
-                <w:sz w:val="18"/>
-              </w:rPr>
-              <w:t xml:space="preserve"> </w:t>
-            </w:r>
-            <w:r>
-              <w:rPr>
-                <w:sz w:val="18"/>
-              </w:rPr>
-              <w:t>324</w:t>
-            </w:r>
-            <w:r>
-              <w:rPr>
-                <w:sz w:val="18"/>
-              </w:rPr>
-              <w:t>.0</w:t>
+              <w:t>118 324.0</w:t>
             </w:r>
           </w:p>
         </w:tc>
@@ -14248,25 +13133,7 @@
               <w:rPr>
                 <w:sz w:val="18"/>
               </w:rPr>
-              <w:t>140</w:t>
-            </w:r>
-            <w:r>
-              <w:rPr>
-                <w:sz w:val="18"/>
-              </w:rPr>
-              <w:t xml:space="preserve"> </w:t>
-            </w:r>
-            <w:r>
-              <w:rPr>
-                <w:sz w:val="18"/>
-              </w:rPr>
-              <w:t>962</w:t>
-            </w:r>
-            <w:r>
-              <w:rPr>
-                <w:sz w:val="18"/>
-              </w:rPr>
-              <w:t>.0</w:t>
+              <w:t>140 962.0</w:t>
             </w:r>
           </w:p>
         </w:tc>
@@ -14366,19 +13233,7 @@
               <w:rPr>
                 <w:sz w:val="18"/>
               </w:rPr>
-              <w:t>51</w:t>
-            </w:r>
-            <w:r>
-              <w:rPr>
-                <w:sz w:val="18"/>
-              </w:rPr>
-              <w:t xml:space="preserve"> </w:t>
-            </w:r>
-            <w:r>
-              <w:rPr>
-                <w:sz w:val="18"/>
-              </w:rPr>
-              <w:t>003.5</w:t>
+              <w:t>51 003.5</w:t>
             </w:r>
           </w:p>
         </w:tc>
@@ -14478,25 +13333,7 @@
               <w:rPr>
                 <w:sz w:val="18"/>
               </w:rPr>
-              <w:t>5</w:t>
-            </w:r>
-            <w:r>
-              <w:rPr>
-                <w:sz w:val="18"/>
-              </w:rPr>
-              <w:t xml:space="preserve"> </w:t>
-            </w:r>
-            <w:r>
-              <w:rPr>
-                <w:sz w:val="18"/>
-              </w:rPr>
-              <w:t>601</w:t>
-            </w:r>
-            <w:r>
-              <w:rPr>
-                <w:sz w:val="18"/>
-              </w:rPr>
-              <w:t>.0</w:t>
+              <w:t>5 601.0</w:t>
             </w:r>
           </w:p>
         </w:tc>
@@ -14596,19 +13433,7 @@
               <w:rPr>
                 <w:sz w:val="18"/>
               </w:rPr>
-              <w:t>35</w:t>
-            </w:r>
-            <w:r>
-              <w:rPr>
-                <w:sz w:val="18"/>
-              </w:rPr>
-              <w:t xml:space="preserve"> </w:t>
-            </w:r>
-            <w:r>
-              <w:rPr>
-                <w:sz w:val="18"/>
-              </w:rPr>
-              <w:t>730.5</w:t>
+              <w:t>35 730.5</w:t>
             </w:r>
           </w:p>
         </w:tc>
@@ -14708,25 +13533,7 @@
               <w:rPr>
                 <w:sz w:val="18"/>
               </w:rPr>
-              <w:t>5</w:t>
-            </w:r>
-            <w:r>
-              <w:rPr>
-                <w:sz w:val="18"/>
-              </w:rPr>
-              <w:t xml:space="preserve"> </w:t>
-            </w:r>
-            <w:r>
-              <w:rPr>
-                <w:sz w:val="18"/>
-              </w:rPr>
-              <w:t>545</w:t>
-            </w:r>
-            <w:r>
-              <w:rPr>
-                <w:sz w:val="18"/>
-              </w:rPr>
-              <w:t>.0</w:t>
+              <w:t>5 545.0</w:t>
             </w:r>
           </w:p>
         </w:tc>
@@ -14826,19 +13633,7 @@
               <w:rPr>
                 <w:sz w:val="18"/>
               </w:rPr>
-              <w:t>47</w:t>
-            </w:r>
-            <w:r>
-              <w:rPr>
-                <w:sz w:val="18"/>
-              </w:rPr>
-              <w:t xml:space="preserve"> </w:t>
-            </w:r>
-            <w:r>
-              <w:rPr>
-                <w:sz w:val="18"/>
-              </w:rPr>
-              <w:t>469.5</w:t>
+              <w:t>47 469.5</w:t>
             </w:r>
           </w:p>
         </w:tc>
@@ -14938,25 +13733,7 @@
               <w:rPr>
                 <w:sz w:val="18"/>
               </w:rPr>
-              <w:t>70</w:t>
-            </w:r>
-            <w:r>
-              <w:rPr>
-                <w:sz w:val="18"/>
-              </w:rPr>
-              <w:t xml:space="preserve"> </w:t>
-            </w:r>
-            <w:r>
-              <w:rPr>
-                <w:sz w:val="18"/>
-              </w:rPr>
-              <w:t>080</w:t>
-            </w:r>
-            <w:r>
-              <w:rPr>
-                <w:sz w:val="18"/>
-              </w:rPr>
-              <w:t>.0</w:t>
+              <w:t>70 080.0</w:t>
             </w:r>
           </w:p>
         </w:tc>
@@ -14974,22 +13751,11 @@
           <w:b/>
         </w:rPr>
         <w:t xml:space="preserve">nie oddaje błędnej </w:t>
-      </w:r>
-      <w:r>
-        <w:rPr>
-          <w:b/>
-        </w:rPr>
         <w:lastRenderedPageBreak/>
         <w:t>odpowiedzi jako poprawnej</w:t>
       </w:r>
       <w:r>
-        <w:t xml:space="preserve">, a tam gdzie potrafił, iteracyjny feedback realnie skracał drogę do rozwiązania. Zewnętrzna, obiektywna brama i twardy warunek stopu okazują się ważniejsze niż rozmiar modelu czy ilość „myślenia” – i to jest lekcja, którą warto zostawić </w:t>
-      </w:r>
-      <w:r>
-        <w:t>sobie i innym</w:t>
-      </w:r>
-      <w:r>
-        <w:t xml:space="preserve"> przed sekcją o pętlach ulepszających same instrukcje.</w:t>
+        <w:t>, a tam gdzie potrafił, iteracyjny feedback realnie skracał drogę do rozwiązania. Zewnętrzna, obiektywna brama i twardy warunek stopu okazują się ważniejsze niż rozmiar modelu czy ilość „myślenia” – i to jest lekcja, którą warto zostawić sobie i innym przed sekcją o pętlach ulepszających same instrukcje.</w:t>
       </w:r>
     </w:p>
     <w:p>
@@ -15015,13 +13781,7 @@
         <w:spacing w:after="120" w:line="276" w:lineRule="auto"/>
       </w:pPr>
       <w:r>
-        <w:t>Do tej pory pętla rozwiązywała zadanie. A co, gdyby skierować ją na same instrukcje, którymi karmimy agenta? To najświeższy nurt w tej dziedzinie (2025–2026) i warto</w:t>
-      </w:r>
-      <w:r>
-        <w:t xml:space="preserve"> o tym napisać,</w:t>
-      </w:r>
-      <w:r>
-        <w:t xml:space="preserve"> bo właśnie tam przesuwa się rola inżyniera.</w:t>
+        <w:t>Do tej pory pętla rozwiązywała zadanie. A co, gdyby skierować ją na same instrukcje, którymi karmimy agenta? To najświeższy nurt w tej dziedzinie (2025–2026) i warto o tym napisać, bo właśnie tam przesuwa się rola inżyniera.</w:t>
       </w:r>
     </w:p>
     <w:p>
@@ -15063,37 +13823,7 @@
         <w:spacing w:after="120" w:line="276" w:lineRule="auto"/>
       </w:pPr>
       <w:r>
-        <w:t>SkillOpt (Microsoft, open-source) robi to z dyscypliną treningu sieci. W kółko: uruchamia agenta na zestawie zadań i zbiera przebiegi</w:t>
-      </w:r>
-      <w:r>
-        <w:t>.</w:t>
-      </w:r>
-      <w:r>
-        <w:t xml:space="preserve"> </w:t>
-      </w:r>
-      <w:r>
-        <w:t>D</w:t>
-      </w:r>
-      <w:r>
-        <w:t>rugi model-optymalizator czyta, co zawiodło</w:t>
-      </w:r>
-      <w:r>
-        <w:t>,</w:t>
-      </w:r>
-      <w:r>
-        <w:t xml:space="preserve"> proponuje drobne edycje skilla (dodaj/usuń/zamień), ograniczone „tekstowym learning rate", żeby nie rozwalić całości</w:t>
-      </w:r>
-      <w:r>
-        <w:t>.</w:t>
-      </w:r>
-      <w:r>
-        <w:t xml:space="preserve"> </w:t>
-      </w:r>
-      <w:r>
-        <w:t>A</w:t>
-      </w:r>
-      <w:r>
-        <w:t xml:space="preserve"> potem brama: zmianę przyjmuje tylko, jeśli realnie poprawia wynik na osobnym zbiorze testowym. Odrzucone edycje trafiają do bufora, żeby błędy się nie powtarzały. Efekt: skill robi się tylko lepszy, nigdy gorszy, a na wyjściu masz mały plik, który nic nie kosztuje przy uruchomieniu. W 52 testowanych konfiguracjach był najlepszy lub równy najlepszemu, a na GPT-5.5 podniósł skuteczność o ponad 23 punkty.</w:t>
+        <w:t>SkillOpt (Microsoft, open-source) robi to z dyscypliną treningu sieci. W kółko: uruchamia agenta na zestawie zadań i zbiera przebiegi. Drugi model-optymalizator czyta, co zawiodło, proponuje drobne edycje skilla (dodaj/usuń/zamień), ograniczone „tekstowym learning rate", żeby nie rozwalić całości. A potem brama: zmianę przyjmuje tylko, jeśli realnie poprawia wynik na osobnym zbiorze testowym. Odrzucone edycje trafiają do bufora, żeby błędy się nie powtarzały. Efekt: skill robi się tylko lepszy, nigdy gorszy, a na wyjściu masz mały plik, który nic nie kosztuje przy uruchomieniu. W 52 testowanych konfiguracjach był najlepszy lub równy najlepszemu, a na GPT-5.5 podniósł skuteczność o ponad 23 punkty.</w:t>
       </w:r>
     </w:p>
     <w:tbl>
@@ -15344,7 +14074,7 @@
               <w:spacing w:after="0" w:line="276" w:lineRule="auto"/>
             </w:pPr>
             <w:r>
-              <w:t>Pętla agentowa to LLM używający narzędzi w cyklu plan – działanie – weryfikacja – iteracja. Jej rdzeń ma recenzowany rodowód (ReAct, Reflexion, Self-Refine), a jeden warunek decyduje o wszystkim: weryfikacja musi być zewnętrzna, bo pewność modelu to nie poprawność. Studium subset-sum pokazuje to dotykalnie: znaleźć rozwiązanie trudno, sprawdzić kandydata łatwo. Pętli nie buduje się do wszystkiego – liczą się powtarzalność, obiektywna brama i twardy warunek stopu, a koszt rośnie szybko. A najnowszy nurt (SkillOpt, GEPA) pokazuje, że tę samą pętlę można skierować na same instrukcje agenta i ulepszać je automatycznie – też tylko za zewnętrzną bramą.</w:t>
+              <w:t xml:space="preserve">Pętla agentowa to LLM używający narzędzi w cyklu plan – działanie – weryfikacja – iteracja. Jej rdzeń ma recenzowany rodowód (ReAct, Reflexion, Self-Refine), a jeden warunek decyduje o wszystkim. Weryfikacja musi być zewnętrzna, bo pewność modelu to nie poprawność. Studium subset-sum pokazuje to dotykalnie, bo znaleźć rozwiązanie jest trudno, a sprawdzić kandydata łatwo. Pętli nie buduje się do wszystkiego. Liczą się powtarzalność, obiektywna brama i twardy warunek stopu, a koszt rośnie szybko. Najnowszy nurt (SkillOpt, GEPA) pokazuje, że tę samą pętlę można skierować na same instrukcje agenta i ulepszać je automatycznie, też tylko za zewnętrzną bramą. Jeśli uczysz tego innych albo budujesz z tym produkt, to jest chyba najważniejsza rzecz do zapamiętania: dobra pętla to nie sprytniejszy model, tylko lepsza brama.</w:t>
             </w:r>
           </w:p>
         </w:tc>
@@ -15616,7 +14346,7 @@
         <w:rPr>
           <w:sz w:val="18"/>
         </w:rPr>
-        <w:t xml:space="preserve"> Effective Context Engineering for AI Agents; Effective Harnesses for Long-Running Agents; How We Built Our Multi-Agent Research System.</w:t>
+        <w:t xml:space="preserve"> Effective Context Engineering for AI Agents. Effective Harnesses for Long-Running Agents. How We Built Our Multi-Agent Research System.</w:t>
       </w:r>
     </w:p>
     <w:p>
@@ -15701,6 +14431,24 @@
           <w:sz w:val="18"/>
         </w:rPr>
         <w:t xml:space="preserve"> Claude Code: Best Practices for Agentic Coding (research → plan → execute → review → ship).</w:t>
+      </w:r>
+    </w:p>
+    <w:p>
+      <w:pPr>
+        <w:spacing w:after="60" w:line="252" w:lineRule="auto"/>
+      </w:pPr>
+      <w:r>
+        <w:rPr>
+          <w:b/>
+          <w:sz w:val="18"/>
+        </w:rPr>
+        <w:t xml:space="preserve">Strus B. (2026).</w:t>
+      </w:r>
+      <w:r>
+        <w:rPr>
+          <w:sz w:val="18"/>
+        </w:rPr>
+        <w:t xml:space="preserve"> Agentic loop – działająca pętla, weryfikatory, pięć problemów i benchmark z sekcji 8. Kod otwarty: github.com/blablast/agentic-loop.</w:t>
       </w:r>
     </w:p>
     <w:sectPr>

</xml_diff>